<commit_message>
Ajustar pagos contrato y avisos de RUC
</commit_message>
<xml_diff>
--- a/app/templates/contrato.docx
+++ b/app/templates/contrato.docx
@@ -335,76 +335,48 @@
         <w:rPr>
           <w:b/>
         </w:rPr>
-        <w:t xml:space="preserve">EFS </w:t>
-      </w:r>
-      <w:r>
-        <w:t>aplica las normas generales del Código Civil</w:t>
-      </w:r>
+        <w:t xml:space="preserve">El préstamo aplica una tasa efectiva anual compensatoria de 30 %, conforme al cronograma de pagos entregado a EL CLIENTE. </w:t>
+      </w:r>
+      <w:r/>
       <w:r>
         <w:rPr>
           <w:vertAlign w:val="superscript"/>
         </w:rPr>
-        <w:footnoteReference w:id="1"/>
-      </w:r>
-      <w:r>
-        <w:t xml:space="preserve"> y se respetan los límites fijados para el pago de intereses hasta la cancelación total del préstamo, siendo la tasa máxima del interés convencional compensatorio o moratorio, la fijad</w:t>
-      </w:r>
-      <w:r>
-        <w:t xml:space="preserve">a por el Banco Central de Reserva del Perú. </w:t>
-      </w:r>
+      </w:r>
+      <w:r/>
+      <w:r/>
     </w:p>
     <w:p>
       <w:pPr>
         <w:ind w:left="-5" w:right="0"/>
       </w:pPr>
       <w:r>
-        <w:t xml:space="preserve">En caso de incumplimiento, </w:t>
-      </w:r>
-      <w:r>
-        <w:rPr>
-          <w:b/>
-        </w:rPr>
-        <w:t>EL CLIENTE</w:t>
-      </w:r>
-      <w:r>
-        <w:t xml:space="preserve"> </w:t>
-      </w:r>
-      <w:r>
-        <w:t>cancelará adicionalmente a los intereses</w:t>
-      </w:r>
-      <w:r>
-        <w:t xml:space="preserve"> moratorios y/o la penalidad pactada por los días de retraso. Los pagos se aplicarán a la deuda en el orden siguiente</w:t>
-      </w:r>
-      <w:r>
-        <w:rPr>
-          <w:b/>
-        </w:rPr>
-        <w:t>:</w:t>
-      </w:r>
-      <w:r>
-        <w:t xml:space="preserve"> las cuotas vencidas y de l</w:t>
-      </w:r>
-      <w:r>
-        <w:t>a cuota vigente</w:t>
-      </w:r>
-      <w:r>
-        <w:t xml:space="preserve">. </w:t>
-      </w:r>
-      <w:r>
-        <w:t xml:space="preserve">En caso de incumplimiento, total o parcial, de cualquiera de las obligaciones a cargo de </w:t>
-      </w:r>
-      <w:r>
-        <w:rPr>
-          <w:b/>
-        </w:rPr>
-        <w:t>EL CLIENTE</w:t>
-      </w:r>
-      <w:r>
-        <w:t xml:space="preserve"> incurrirán en mora automáticamente, sin necesidad de aviso judicial</w:t>
-      </w:r>
-      <w:r>
-        <w:t xml:space="preserve">. </w:t>
-      </w:r>
+        <w:t xml:space="preserve">Los pagos cubren cuotas completas consecutivas desde la más antigua pendiente, incluyendo el capital y el interés compensatorio del cronograma. El atraso no genera recargos ni penalidades. </w:t>
+      </w:r>
+      <w:r>
+        <w:rPr>
+          <w:b/>
+        </w:rPr>
+      </w:r>
+      <w:r/>
+      <w:r/>
+      <w:r/>
+      <w:r>
+        <w:rPr>
+          <w:b/>
+        </w:rPr>
+      </w:r>
+      <w:r/>
+      <w:r/>
+      <w:r/>
+      <w:r/>
+      <w:r>
+        <w:rPr>
+          <w:b/>
+        </w:rPr>
+      </w:r>
+      <w:r/>
+      <w:r/>
     </w:p>
     <w:p>
       <w:pPr>
@@ -2072,523 +2044,6 @@
         </w:tc>
       </w:tr>
     </w:tbl>
-    <w:p>
-      <w:pPr>
-        <w:spacing w:after="0" w:line="259" w:lineRule="auto"/>
-        <w:ind w:left="0" w:right="0" w:firstLine="0"/>
-        <w:jc w:val="left"/>
-      </w:pPr>
-    </w:p>
-    <w:p>
-      <w:r>
-        <w:br w:type="page"/>
-      </w:r>
-    </w:p>
-    <w:p>
-      <w:pPr>
-        <w:pStyle w:val="Ttulo1"/>
-      </w:pPr>
-      <w:r>
-        <w:t>Condiciones particulares del préstamo</w:t>
-      </w:r>
-    </w:p>
-    <w:p>
-      <w:r>
-        <w:t>Este anexo identifica las condiciones registradas del préstamo y acompaña el cronograma de pagos entregado por separado. El texto del contrato corresponde al modelo proporcionado para el parcial.</w:t>
-      </w:r>
-    </w:p>
-    <w:tbl>
-      <w:tblPr>
-        <w:tblStyle w:val="Tablaconcuadrcula"/>
-        <w:tblW w:type="auto" w:w="0"/>
-        <w:tblLook w:firstColumn="1" w:firstRow="1" w:lastColumn="0" w:lastRow="0" w:noHBand="0" w:noVBand="1" w:val="04A0"/>
-      </w:tblPr>
-      <w:tblGrid>
-        <w:gridCol w:w="4253"/>
-        <w:gridCol w:w="4253"/>
-      </w:tblGrid>
-      <w:tr>
-        <w:tc>
-          <w:tcPr>
-            <w:tcW w:type="dxa" w:w="4253"/>
-          </w:tcPr>
-          <w:p>
-            <w:r>
-              <w:rPr>
-                <w:sz w:val="20"/>
-              </w:rPr>
-              <w:t>Número de préstamo</w:t>
-            </w:r>
-          </w:p>
-        </w:tc>
-        <w:tc>
-          <w:tcPr>
-            <w:tcW w:type="dxa" w:w="4253"/>
-          </w:tcPr>
-          <w:p>
-            <w:r>
-              <w:rPr>
-                <w:sz w:val="20"/>
-              </w:rPr>
-              <w:t>{{CODIGO}}</w:t>
-            </w:r>
-          </w:p>
-        </w:tc>
-      </w:tr>
-      <w:tr>
-        <w:tc>
-          <w:tcPr>
-            <w:tcW w:type="dxa" w:w="4253"/>
-          </w:tcPr>
-          <w:p>
-            <w:r>
-              <w:rPr>
-                <w:sz w:val="20"/>
-              </w:rPr>
-              <w:t>Titular</w:t>
-            </w:r>
-          </w:p>
-        </w:tc>
-        <w:tc>
-          <w:tcPr>
-            <w:tcW w:type="dxa" w:w="4253"/>
-          </w:tcPr>
-          <w:p>
-            <w:r>
-              <w:rPr>
-                <w:sz w:val="20"/>
-              </w:rPr>
-              <w:t>{{CLIENTE}}</w:t>
-            </w:r>
-          </w:p>
-        </w:tc>
-      </w:tr>
-      <w:tr>
-        <w:tc>
-          <w:tcPr>
-            <w:tcW w:type="dxa" w:w="4253"/>
-          </w:tcPr>
-          <w:p>
-            <w:r>
-              <w:rPr>
-                <w:sz w:val="20"/>
-              </w:rPr>
-              <w:t>Documento</w:t>
-            </w:r>
-          </w:p>
-        </w:tc>
-        <w:tc>
-          <w:tcPr>
-            <w:tcW w:type="dxa" w:w="4253"/>
-          </w:tcPr>
-          <w:p>
-            <w:r>
-              <w:rPr>
-                <w:sz w:val="20"/>
-              </w:rPr>
-              <w:t>{{DOCUMENTO}}</w:t>
-            </w:r>
-          </w:p>
-        </w:tc>
-      </w:tr>
-      <w:tr>
-        <w:tc>
-          <w:tcPr>
-            <w:tcW w:type="dxa" w:w="4253"/>
-          </w:tcPr>
-          <w:p>
-            <w:r>
-              <w:rPr>
-                <w:sz w:val="20"/>
-              </w:rPr>
-              <w:t>Propietario para el límite global</w:t>
-            </w:r>
-          </w:p>
-        </w:tc>
-        <w:tc>
-          <w:tcPr>
-            <w:tcW w:type="dxa" w:w="4253"/>
-          </w:tcPr>
-          <w:p>
-            <w:r>
-              <w:rPr>
-                <w:sz w:val="20"/>
-              </w:rPr>
-              <w:t>{{PROPIETARIO}}</w:t>
-            </w:r>
-          </w:p>
-        </w:tc>
-      </w:tr>
-      <w:tr>
-        <w:tc>
-          <w:tcPr>
-            <w:tcW w:type="dxa" w:w="4253"/>
-          </w:tcPr>
-          <w:p>
-            <w:r>
-              <w:rPr>
-                <w:sz w:val="20"/>
-              </w:rPr>
-              <w:t>Representante que firma</w:t>
-            </w:r>
-          </w:p>
-        </w:tc>
-        <w:tc>
-          <w:tcPr>
-            <w:tcW w:type="dxa" w:w="4253"/>
-          </w:tcPr>
-          <w:p>
-            <w:r>
-              <w:rPr>
-                <w:sz w:val="20"/>
-              </w:rPr>
-              <w:t>{{FIRMANTE}}</w:t>
-            </w:r>
-          </w:p>
-        </w:tc>
-      </w:tr>
-      <w:tr>
-        <w:tc>
-          <w:tcPr>
-            <w:tcW w:type="dxa" w:w="4253"/>
-          </w:tcPr>
-          <w:p>
-            <w:r>
-              <w:rPr>
-                <w:sz w:val="20"/>
-              </w:rPr>
-              <w:t>Agencia de origen</w:t>
-            </w:r>
-          </w:p>
-        </w:tc>
-        <w:tc>
-          <w:tcPr>
-            <w:tcW w:type="dxa" w:w="4253"/>
-          </w:tcPr>
-          <w:p>
-            <w:r>
-              <w:rPr>
-                <w:sz w:val="20"/>
-              </w:rPr>
-              <w:t>{{AGENCIA}}</w:t>
-            </w:r>
-          </w:p>
-        </w:tc>
-      </w:tr>
-      <w:tr>
-        <w:tc>
-          <w:tcPr>
-            <w:tcW w:type="dxa" w:w="4253"/>
-          </w:tcPr>
-          <w:p>
-            <w:r>
-              <w:rPr>
-                <w:sz w:val="20"/>
-              </w:rPr>
-              <w:t>Fecha de desembolso</w:t>
-            </w:r>
-          </w:p>
-        </w:tc>
-        <w:tc>
-          <w:tcPr>
-            <w:tcW w:type="dxa" w:w="4253"/>
-          </w:tcPr>
-          <w:p>
-            <w:r>
-              <w:rPr>
-                <w:sz w:val="20"/>
-              </w:rPr>
-              <w:t>{{FECHA}}</w:t>
-            </w:r>
-          </w:p>
-        </w:tc>
-      </w:tr>
-      <w:tr>
-        <w:tc>
-          <w:tcPr>
-            <w:tcW w:type="dxa" w:w="4253"/>
-          </w:tcPr>
-          <w:p>
-            <w:r>
-              <w:rPr>
-                <w:sz w:val="20"/>
-              </w:rPr>
-              <w:t>Capital entregado</w:t>
-            </w:r>
-          </w:p>
-        </w:tc>
-        <w:tc>
-          <w:tcPr>
-            <w:tcW w:type="dxa" w:w="4253"/>
-          </w:tcPr>
-          <w:p>
-            <w:r>
-              <w:rPr>
-                <w:sz w:val="20"/>
-              </w:rPr>
-              <w:t>{{MONTO}}</w:t>
-            </w:r>
-          </w:p>
-        </w:tc>
-      </w:tr>
-      <w:tr>
-        <w:tc>
-          <w:tcPr>
-            <w:tcW w:type="dxa" w:w="4253"/>
-          </w:tcPr>
-          <w:p>
-            <w:r>
-              <w:rPr>
-                <w:sz w:val="20"/>
-              </w:rPr>
-              <w:t>Plazo</w:t>
-            </w:r>
-          </w:p>
-        </w:tc>
-        <w:tc>
-          <w:tcPr>
-            <w:tcW w:type="dxa" w:w="4253"/>
-          </w:tcPr>
-          <w:p>
-            <w:r>
-              <w:rPr>
-                <w:sz w:val="20"/>
-              </w:rPr>
-              <w:t>{{PLAZO}} meses</w:t>
-            </w:r>
-          </w:p>
-        </w:tc>
-      </w:tr>
-      <w:tr>
-        <w:tc>
-          <w:tcPr>
-            <w:tcW w:type="dxa" w:w="4253"/>
-          </w:tcPr>
-          <w:p>
-            <w:r>
-              <w:rPr>
-                <w:sz w:val="20"/>
-              </w:rPr>
-              <w:t>Tasa efectiva anual compensatoria</w:t>
-            </w:r>
-          </w:p>
-        </w:tc>
-        <w:tc>
-          <w:tcPr>
-            <w:tcW w:type="dxa" w:w="4253"/>
-          </w:tcPr>
-          <w:p>
-            <w:r>
-              <w:rPr>
-                <w:sz w:val="20"/>
-              </w:rPr>
-              <w:t>30 %</w:t>
-            </w:r>
-          </w:p>
-        </w:tc>
-      </w:tr>
-      <w:tr>
-        <w:tc>
-          <w:tcPr>
-            <w:tcW w:type="dxa" w:w="4253"/>
-          </w:tcPr>
-          <w:p>
-            <w:r>
-              <w:rPr>
-                <w:sz w:val="20"/>
-              </w:rPr>
-              <w:t>Tasa efectiva mensual</w:t>
-            </w:r>
-          </w:p>
-        </w:tc>
-        <w:tc>
-          <w:tcPr>
-            <w:tcW w:type="dxa" w:w="4253"/>
-          </w:tcPr>
-          <w:p>
-            <w:r>
-              <w:rPr>
-                <w:sz w:val="20"/>
-              </w:rPr>
-              <w:t>2,210445 %</w:t>
-            </w:r>
-          </w:p>
-        </w:tc>
-      </w:tr>
-      <w:tr>
-        <w:tc>
-          <w:tcPr>
-            <w:tcW w:type="dxa" w:w="4253"/>
-          </w:tcPr>
-          <w:p>
-            <w:r>
-              <w:rPr>
-                <w:sz w:val="20"/>
-              </w:rPr>
-              <w:t>Interés original total</w:t>
-            </w:r>
-          </w:p>
-        </w:tc>
-        <w:tc>
-          <w:tcPr>
-            <w:tcW w:type="dxa" w:w="4253"/>
-          </w:tcPr>
-          <w:p>
-            <w:r>
-              <w:rPr>
-                <w:sz w:val="20"/>
-              </w:rPr>
-              <w:t>{{INTERES_TOTAL}}</w:t>
-            </w:r>
-          </w:p>
-        </w:tc>
-      </w:tr>
-      <w:tr>
-        <w:tc>
-          <w:tcPr>
-            <w:tcW w:type="dxa" w:w="4253"/>
-          </w:tcPr>
-          <w:p>
-            <w:r>
-              <w:rPr>
-                <w:sz w:val="20"/>
-              </w:rPr>
-              <w:t>Total programado sin mora</w:t>
-            </w:r>
-          </w:p>
-        </w:tc>
-        <w:tc>
-          <w:tcPr>
-            <w:tcW w:type="dxa" w:w="4253"/>
-          </w:tcPr>
-          <w:p>
-            <w:r>
-              <w:rPr>
-                <w:sz w:val="20"/>
-              </w:rPr>
-              <w:t>{{TOTAL}}</w:t>
-            </w:r>
-          </w:p>
-        </w:tc>
-      </w:tr>
-      <w:tr>
-        <w:tc>
-          <w:tcPr>
-            <w:tcW w:type="dxa" w:w="4253"/>
-          </w:tcPr>
-          <w:p>
-            <w:r>
-              <w:rPr>
-                <w:sz w:val="20"/>
-              </w:rPr>
-              <w:t>Primer vencimiento</w:t>
-            </w:r>
-          </w:p>
-        </w:tc>
-        <w:tc>
-          <w:tcPr>
-            <w:tcW w:type="dxa" w:w="4253"/>
-          </w:tcPr>
-          <w:p>
-            <w:r>
-              <w:rPr>
-                <w:sz w:val="20"/>
-              </w:rPr>
-              <w:t>{{PRIMER_VENCIMIENTO}}</w:t>
-            </w:r>
-          </w:p>
-        </w:tc>
-      </w:tr>
-      <w:tr>
-        <w:tc>
-          <w:tcPr>
-            <w:tcW w:type="dxa" w:w="4253"/>
-          </w:tcPr>
-          <w:p>
-            <w:r>
-              <w:rPr>
-                <w:sz w:val="20"/>
-              </w:rPr>
-              <w:t>Último vencimiento</w:t>
-            </w:r>
-          </w:p>
-        </w:tc>
-        <w:tc>
-          <w:tcPr>
-            <w:tcW w:type="dxa" w:w="4253"/>
-          </w:tcPr>
-          <w:p>
-            <w:r>
-              <w:rPr>
-                <w:sz w:val="20"/>
-              </w:rPr>
-              <w:t>{{ULTIMO_VENCIMIENTO}}</w:t>
-            </w:r>
-          </w:p>
-        </w:tc>
-      </w:tr>
-      <w:tr>
-        <w:tc>
-          <w:tcPr>
-            <w:tcW w:type="dxa" w:w="4253"/>
-          </w:tcPr>
-          <w:p>
-            <w:r>
-              <w:rPr>
-                <w:sz w:val="20"/>
-              </w:rPr>
-              <w:t>Tasa efectiva anual moratoria</w:t>
-            </w:r>
-          </w:p>
-        </w:tc>
-        <w:tc>
-          <w:tcPr>
-            <w:tcW w:type="dxa" w:w="4253"/>
-          </w:tcPr>
-          <w:p>
-            <w:r>
-              <w:rPr>
-                <w:sz w:val="20"/>
-              </w:rPr>
-              <w:t>{{TASA_MORA}}</w:t>
-            </w:r>
-          </w:p>
-        </w:tc>
-      </w:tr>
-      <w:tr>
-        <w:tc>
-          <w:tcPr>
-            <w:tcW w:type="dxa" w:w="4253"/>
-          </w:tcPr>
-          <w:p>
-            <w:r>
-              <w:rPr>
-                <w:sz w:val="20"/>
-              </w:rPr>
-              <w:t>Base anual de mora</w:t>
-            </w:r>
-          </w:p>
-        </w:tc>
-        <w:tc>
-          <w:tcPr>
-            <w:tcW w:type="dxa" w:w="4253"/>
-          </w:tcPr>
-          <w:p>
-            <w:r>
-              <w:rPr>
-                <w:sz w:val="20"/>
-              </w:rPr>
-              <w:t>{{BASE_MORA}} días</w:t>
-            </w:r>
-          </w:p>
-        </w:tc>
-      </w:tr>
-    </w:tbl>
-    <w:p>
-      <w:r>
-        <w:t>La mora, si existe una tasa pactada, se calcula por días sobre el capital vencido impago: capital × [(1 + tasa anual)^(días / base) − 1]. Los pagos cubren cuotas completas consecutivas desde la más antigua, incluyendo capital, interés original y mora de las cuotas seleccionadas. No se agregan penalidades.</w:t>
-      </w:r>
-    </w:p>
     <w:sectPr>
       <w:footerReference w:type="even" r:id="rId8"/>
       <w:footerReference w:type="default" r:id="rId9"/>
@@ -2826,10 +2281,10 @@
         <w:footnoteRef/>
       </w:r>
       <w:r>
-        <w:t xml:space="preserve"> Art. 1242 del Código Civil “El interés es compensatorio cuando constituye la contraprestación por el uso de dinero o de cualquier otro bien. Es moratorio cuanto tiene por finalidad indemnizar</w:t>
-      </w:r>
-      <w:r>
-        <w:t xml:space="preserve"> la mora en el pago”. </w:t>
+        <w:t xml:space="preserve"> Art. 1242 del Código Civil “El interés es compensatorio cuando constituye la contraprestación por el uso de dinero o de cualquier otro bien”. </w:t>
+      </w:r>
+      <w:r>
+        <w:t xml:space="preserve"/>
       </w:r>
     </w:p>
   </w:footnote>

</xml_diff>

<commit_message>
Agilizar evaluación y precisar firmantes en contratos RUC 20
</commit_message>
<xml_diff>
--- a/app/templates/contrato.docx
+++ b/app/templates/contrato.docx
@@ -1988,7 +1988,17 @@
               <w:jc w:val="left"/>
             </w:pPr>
             <w:r>
-              <w:t>{{DOCUMENTO_FIRMA}}</w:t>
+              <w:t>{{FIRMANTE}}</w:t>
+            </w:r>
+          </w:p>
+          <w:p>
+            <w:pPr>
+              <w:spacing w:after="0" w:line="259" w:lineRule="auto"/>
+              <w:ind w:left="0" w:right="0" w:firstLine="0"/>
+              <w:jc w:val="left"/>
+            </w:pPr>
+            <w:r>
+              <w:t>{{CALIDAD_FIRMANTE}}</w:t>
             </w:r>
           </w:p>
         </w:tc>

</xml_diff>